<commit_message>
app can change ip
</commit_message>
<xml_diff>
--- a/電腦網路程式作業題目 (1).docx
+++ b/電腦網路程式作業題目 (1).docx
@@ -23,21 +23,7 @@
           <w:rFonts w:ascii="標楷體" w:eastAsia="標楷體" w:hAnsi="標楷體"/>
         </w:rPr>
         <w:br/>
-        <w:t>請</w:t>
-      </w:r>
-      <w:proofErr w:type="gramStart"/>
-      <w:r>
-        <w:rPr>
-          <w:rFonts w:ascii="標楷體" w:eastAsia="標楷體" w:hAnsi="標楷體"/>
-        </w:rPr>
-        <w:t>設計並實作</w:t>
-      </w:r>
-      <w:proofErr w:type="gramEnd"/>
-      <w:r>
-        <w:rPr>
-          <w:rFonts w:ascii="標楷體" w:eastAsia="標楷體" w:hAnsi="標楷體"/>
-        </w:rPr>
-        <w:t>一個「多人連線你答我猜－1A2B猜數字系統」，並以程式完成此功能，不限使用語言。系統可採用網頁或APP形式實作，</w:t>
+        <w:t>請設計並實作一個「多人連線你答我猜－1A2B猜數字系統」，並以程式完成此功能，不限使用語言。系統可採用網頁或APP形式實作，</w:t>
       </w:r>
       <w:r>
         <w:rPr>
@@ -95,35 +81,7 @@
         <w:rPr>
           <w:rFonts w:ascii="標楷體" w:eastAsia="標楷體" w:hAnsi="標楷體"/>
         </w:rPr>
-        <w:t>遊戲採用「1A2B猜數字」玩法，每一輪由一位玩家擔任出題者，輸入一組4位數且數字不重複的數字作為答案，其餘玩家</w:t>
-      </w:r>
-      <w:proofErr w:type="gramStart"/>
-      <w:r>
-        <w:rPr>
-          <w:rFonts w:ascii="標楷體" w:eastAsia="標楷體" w:hAnsi="標楷體"/>
-        </w:rPr>
-        <w:t>作為猜題者</w:t>
-      </w:r>
-      <w:proofErr w:type="gramEnd"/>
-      <w:r>
-        <w:rPr>
-          <w:rFonts w:ascii="標楷體" w:eastAsia="標楷體" w:hAnsi="標楷體"/>
-        </w:rPr>
-        <w:t>進行猜測。Server會將當前回合資訊同步至所有Client端，</w:t>
-      </w:r>
-      <w:proofErr w:type="gramStart"/>
-      <w:r>
-        <w:rPr>
-          <w:rFonts w:ascii="標楷體" w:eastAsia="標楷體" w:hAnsi="標楷體"/>
-        </w:rPr>
-        <w:t>猜題者輸入</w:t>
-      </w:r>
-      <w:proofErr w:type="gramEnd"/>
-      <w:r>
-        <w:rPr>
-          <w:rFonts w:ascii="標楷體" w:eastAsia="標楷體" w:hAnsi="標楷體"/>
-        </w:rPr>
-        <w:t>猜測數字後，Server計算並回傳結果（幾A幾B）。</w:t>
+        <w:t>遊戲採用「1A2B猜數字」玩法，每一輪由一位玩家擔任出題者，輸入一組4位數且數字不重複的數字作為答案，其餘玩家作為猜題者進行猜測。Server會將當前回合資訊同步至所有Client端，猜題者輸入猜測數字後，Server計算並回傳結果（幾A幾B）。</w:t>
       </w:r>
     </w:p>
     <w:p>
@@ -217,35 +175,7 @@
           <w:rFonts w:ascii="標楷體" w:eastAsia="標楷體" w:hAnsi="標楷體"/>
         </w:rPr>
         <w:br/>
-        <w:t xml:space="preserve">若正確答案為 1234，某玩家猜測 1325，則結果為 1A2B（1 </w:t>
-      </w:r>
-      <w:proofErr w:type="gramStart"/>
-      <w:r>
-        <w:rPr>
-          <w:rFonts w:ascii="標楷體" w:eastAsia="標楷體" w:hAnsi="標楷體"/>
-        </w:rPr>
-        <w:t>個</w:t>
-      </w:r>
-      <w:proofErr w:type="gramEnd"/>
-      <w:r>
-        <w:rPr>
-          <w:rFonts w:ascii="標楷體" w:eastAsia="標楷體" w:hAnsi="標楷體"/>
-        </w:rPr>
-        <w:t xml:space="preserve">數字位置正確，2 </w:t>
-      </w:r>
-      <w:proofErr w:type="gramStart"/>
-      <w:r>
-        <w:rPr>
-          <w:rFonts w:ascii="標楷體" w:eastAsia="標楷體" w:hAnsi="標楷體"/>
-        </w:rPr>
-        <w:t>個</w:t>
-      </w:r>
-      <w:proofErr w:type="gramEnd"/>
-      <w:r>
-        <w:rPr>
-          <w:rFonts w:ascii="標楷體" w:eastAsia="標楷體" w:hAnsi="標楷體"/>
-        </w:rPr>
-        <w:t>數字正確但位置錯誤）</w:t>
+        <w:t>若正確答案為 1234，某玩家猜測 1325，則結果為 1A2B（1 個數字位置正確，2 個數字正確但位置錯誤）</w:t>
       </w:r>
     </w:p>
     <w:p>
@@ -361,13 +291,7 @@
         <w:rPr>
           <w:rFonts w:ascii="標楷體" w:eastAsia="標楷體" w:hAnsi="標楷體" w:hint="eastAsia"/>
         </w:rPr>
-        <w:t>V</w:t>
-      </w:r>
-      <w:r>
-        <w:rPr>
-          <w:rFonts w:ascii="標楷體" w:eastAsia="標楷體" w:hAnsi="標楷體" w:hint="eastAsia"/>
-        </w:rPr>
-        <w:t xml:space="preserve"> </w:t>
+        <w:t xml:space="preserve">V </w:t>
       </w:r>
       <w:r>
         <w:rPr>
@@ -591,12 +515,6 @@
       </w:pPr>
       <w:r>
         <w:rPr>
-          <w:rFonts w:ascii="標楷體" w:eastAsia="標楷體" w:hAnsi="標楷體" w:hint="eastAsia"/>
-        </w:rPr>
-        <w:t>V</w:t>
-      </w:r>
-      <w:r>
-        <w:rPr>
           <w:rFonts w:ascii="標楷體" w:eastAsia="標楷體" w:hAnsi="標楷體"/>
         </w:rPr>
         <w:t xml:space="preserve">限時作答機制 </w:t>
@@ -614,6 +532,12 @@
       </w:pPr>
       <w:r>
         <w:rPr>
+          <w:rFonts w:ascii="標楷體" w:eastAsia="標楷體" w:hAnsi="標楷體" w:hint="eastAsia"/>
+        </w:rPr>
+        <w:t>V</w:t>
+      </w:r>
+      <w:r>
+        <w:rPr>
           <w:rFonts w:ascii="標楷體" w:eastAsia="標楷體" w:hAnsi="標楷體"/>
         </w:rPr>
         <w:t xml:space="preserve">視窗美化（UI設計） </w:t>
@@ -830,44 +754,8 @@
         <w:rPr>
           <w:rFonts w:ascii="標楷體" w:eastAsia="標楷體" w:hAnsi="標楷體" w:hint="eastAsia"/>
         </w:rPr>
-        <w:t>作業標題：”學號_姓名.pdf</w:t>
-      </w:r>
-      <w:proofErr w:type="gramStart"/>
-      <w:r>
-        <w:rPr>
-          <w:rFonts w:ascii="標楷體" w:eastAsia="標楷體" w:hAnsi="標楷體" w:hint="eastAsia"/>
-        </w:rPr>
-        <w:t>”</w:t>
-      </w:r>
-      <w:proofErr w:type="gramEnd"/>
-      <w:r>
-        <w:rPr>
-          <w:rFonts w:ascii="標楷體" w:eastAsia="標楷體" w:hAnsi="標楷體" w:hint="eastAsia"/>
-        </w:rPr>
-        <w:t>、</w:t>
-      </w:r>
-      <w:proofErr w:type="gramStart"/>
-      <w:r>
-        <w:rPr>
-          <w:rFonts w:ascii="標楷體" w:eastAsia="標楷體" w:hAnsi="標楷體" w:hint="eastAsia"/>
-        </w:rPr>
-        <w:t>＂</w:t>
-      </w:r>
-      <w:proofErr w:type="gramEnd"/>
-      <w:r>
-        <w:rPr>
-          <w:rFonts w:ascii="標楷體" w:eastAsia="標楷體" w:hAnsi="標楷體" w:hint="eastAsia"/>
-        </w:rPr>
-        <w:t>學號_姓名.mp4</w:t>
-      </w:r>
-      <w:proofErr w:type="gramStart"/>
-      <w:r>
-        <w:rPr>
-          <w:rFonts w:ascii="標楷體" w:eastAsia="標楷體" w:hAnsi="標楷體" w:hint="eastAsia"/>
-        </w:rPr>
-        <w:t>＂</w:t>
-      </w:r>
-      <w:proofErr w:type="gramEnd"/>
+        <w:t>作業標題：”學號_姓名.pdf”、＂學號_姓名.mp4＂</w:t>
+      </w:r>
     </w:p>
     <w:p>
       <w:pPr>

</xml_diff>